<commit_message>
Update Manual Word Document and generator script: remove all accents and special characters to fix encoding issues
</commit_message>
<xml_diff>
--- a/Manual_Gerador_Tanium_V3.docx
+++ b/Manual_Gerador_Tanium_V3.docx
@@ -18,7 +18,7 @@
           <w:color w:val="1E38BF"/>
           <w:sz w:val="48"/>
         </w:rPr>
-        <w:t>Manual de Uso: Gerador Tanium &amp; Agendador de GMUD (V3)</w:t>
+        <w:t>Manual de Uso: Gerador Tanium e Agendador de GMUD (V3)</w:t>
       </w:r>
     </w:p>
     <w:p>
@@ -35,7 +35,7 @@
           <w:i/>
           <w:color w:val="808080"/>
         </w:rPr>
-        <w:t>Guia passo a passo para extraÃ§Ã£o de dados e agendamento de comunicados de GMUD via Outlook local.</w:t>
+        <w:t>Guia passo a passo para extracao de dados e agendamento de comunicados de GMUD via Outlook local.</w:t>
       </w:r>
     </w:p>
     <w:p>
@@ -126,7 +126,7 @@
           <w:color w:val="1E38BF"/>
           <w:sz w:val="22"/>
         </w:rPr>
-        <w:t xml:space="preserve"> - ExpressÃ£o regular (Regex) pronta para deploy no Tanium;</w:t>
+        <w:t xml:space="preserve"> - Expressao regular (Regex) pronta para deploy no Tanium;</w:t>
       </w:r>
     </w:p>
     <w:p>
@@ -166,7 +166,7 @@
           <w:color w:val="1E38BF"/>
           <w:sz w:val="22"/>
         </w:rPr>
-        <w:t xml:space="preserve"> - Script do PowerShell para agendamento de envio automÃ¡tico via Outlook sem necessidade de permissÃµes de administrador.</w:t>
+        <w:t xml:space="preserve"> - Script do PowerShell para agendamento de envio automatico via Outlook sem necessidade de permissoes de administrador.</w:t>
       </w:r>
     </w:p>
     <w:p>
@@ -229,7 +229,7 @@
           <w:color w:val="1E38BF"/>
           <w:sz w:val="22"/>
         </w:rPr>
-        <w:t>Copie o e-mail completo que vocÃª recebeu com a solicitaÃ§Ã£o da GMUD.</w:t>
+        <w:t>Copie o e-mail completo que voce recebeu com a solicitacao da GMUD.</w:t>
       </w:r>
     </w:p>
     <w:p>
@@ -258,7 +258,7 @@
           <w:color w:val="1E38BF"/>
           <w:sz w:val="22"/>
         </w:rPr>
-        <w:t>Cole o conteÃºdo copiado na Ã¡rea azul escuro 'Colar E-mail da GMUD (ExtraÃ§Ã£o AutomÃ¡tica)'.</w:t>
+        <w:t>Cole o conteudo copiado na area azul escuro 'Colar E-mail da GMUD (Extracao Automatica)'.</w:t>
       </w:r>
     </w:p>
     <w:p>
@@ -287,7 +287,7 @@
           <w:color w:val="1E38BF"/>
           <w:sz w:val="22"/>
         </w:rPr>
-        <w:t>Clique no botÃ£o 'Analisar E-mail e Preencher Campos'.</w:t>
+        <w:t>Clique no botao 'Analisar E-mail e Preencher Campos'.</w:t>
       </w:r>
     </w:p>
     <w:p>
@@ -316,7 +316,7 @@
           <w:color w:val="1E38BF"/>
           <w:sz w:val="22"/>
         </w:rPr>
-        <w:t>Confirme se a data, hora, nÃºmero da GMUD e lista de servidores foram preenchidos corretamente.</w:t>
+        <w:t>Confirme se a data, hora, numero da GMUD e lista de servidores foram preenchidos corretamente.</w:t>
       </w:r>
     </w:p>
     <w:p>
@@ -345,7 +345,7 @@
           <w:color w:val="1E38BF"/>
           <w:sz w:val="22"/>
         </w:rPr>
-        <w:t>Na lista de e-mails extraÃ­dos, revise o direcionamento automÃ¡tico (e-mails @claranet.com vÃ£o para CÃ³pia (Cc) e demais para Para (To)).</w:t>
+        <w:t>Na lista de e-mails extraidos, revise o direcionamento automatico (e-mails @claranet.com vao para Copia (Cc) e demais para Para (To)).</w:t>
       </w:r>
     </w:p>
     <w:p>
@@ -461,7 +461,7 @@
           <w:color w:val="1E38BF"/>
           <w:sz w:val="22"/>
         </w:rPr>
-        <w:t>Na tela preta do PowerShell, cole com Ctrl+V e pressione Enter. A janela piscarÃ¡ o Outlook para preencher a assinatura, agendarÃ¡ o e-mail na Caixa de SaÃ­da e se fecharÃ¡.</w:t>
+        <w:t>Na tela preta do PowerShell, cole com Ctrl+V e pressione Enter. A janela piscara o Outlook para preencher a assinatura, agendara o e-mail na Caixa de Saida e se fechara.</w:t>
       </w:r>
     </w:p>
     <w:p>
@@ -495,25 +495,7 @@
           <w:color w:val="FF0000"/>
           <w:sz w:val="28"/>
         </w:rPr>
-        <w:t>âš ï¸</w:t>
-      </w:r>
-      <w:r>
-        <w:rPr>
-          <w:rFonts w:ascii="Calibri" w:hAnsi="Calibri" w:cs="Calibri"/>
-          <w:b/>
-          <w:color w:val="FF0000"/>
-          <w:sz w:val="28"/>
-        </w:rPr>
-        <w:t></w:t>
-      </w:r>
-      <w:r>
-        <w:rPr>
-          <w:rFonts w:ascii="Calibri" w:hAnsi="Calibri"/>
-          <w:b/>
-          <w:color w:val="FF0000"/>
-          <w:sz w:val="28"/>
-        </w:rPr>
-        <w:t xml:space="preserve"> IMPORTANTE</w:t>
+        <w:t>AVISOS IMPORTANTES</w:t>
       </w:r>
     </w:p>
     <w:p>
@@ -533,7 +515,7 @@
           <w:color w:val="000000"/>
           <w:sz w:val="22"/>
         </w:rPr>
-        <w:t>1. O e-mail agendado ficarÃ¡ salvo na pasta 'Caixa de SaÃ­da' (Outbox) do seu Outlook local.</w:t>
+        <w:t>1. O e-mail agendado ficara salvo na pasta 'Caixa de Saida' (Outbox) do seu Outlook local.</w:t>
       </w:r>
     </w:p>
     <w:p>
@@ -573,7 +555,7 @@
           <w:color w:val="000000"/>
           <w:sz w:val="22"/>
         </w:rPr>
-        <w:t>3. NÃ£o altere o e-mail na Caixa de SaÃ­da manualmente apÃ³s o agendamento para evitar que ele perca a propriedade de envio automÃ¡tico.</w:t>
+        <w:t>3. Nao altere o e-mail na Caixa de Saida manualmente apos o agendamento para evitar que ele perca a propriedade de envio automatico.</w:t>
       </w:r>
     </w:p>
     <w:p>
@@ -1018,7 +1000,7 @@
     <w:link w:val="Ttulo1Char"/>
     <w:uiPriority w:val="9"/>
     <w:qFormat/>
-    <w:rsid w:val="00095EEA"/>
+    <w:rsid w:val="00FF6748"/>
     <w:pPr>
       <w:keepNext/>
       <w:keepLines/>
@@ -1041,7 +1023,7 @@
     <w:semiHidden/>
     <w:unhideWhenUsed/>
     <w:qFormat/>
-    <w:rsid w:val="00095EEA"/>
+    <w:rsid w:val="00FF6748"/>
     <w:pPr>
       <w:keepNext/>
       <w:keepLines/>
@@ -1064,7 +1046,7 @@
     <w:semiHidden/>
     <w:unhideWhenUsed/>
     <w:qFormat/>
-    <w:rsid w:val="00095EEA"/>
+    <w:rsid w:val="00FF6748"/>
     <w:pPr>
       <w:keepNext/>
       <w:keepLines/>
@@ -1087,7 +1069,7 @@
     <w:semiHidden/>
     <w:unhideWhenUsed/>
     <w:qFormat/>
-    <w:rsid w:val="00095EEA"/>
+    <w:rsid w:val="00FF6748"/>
     <w:pPr>
       <w:keepNext/>
       <w:keepLines/>
@@ -1110,7 +1092,7 @@
     <w:semiHidden/>
     <w:unhideWhenUsed/>
     <w:qFormat/>
-    <w:rsid w:val="00095EEA"/>
+    <w:rsid w:val="00FF6748"/>
     <w:pPr>
       <w:keepNext/>
       <w:keepLines/>
@@ -1131,7 +1113,7 @@
     <w:semiHidden/>
     <w:unhideWhenUsed/>
     <w:qFormat/>
-    <w:rsid w:val="00095EEA"/>
+    <w:rsid w:val="00FF6748"/>
     <w:pPr>
       <w:keepNext/>
       <w:keepLines/>
@@ -1154,7 +1136,7 @@
     <w:semiHidden/>
     <w:unhideWhenUsed/>
     <w:qFormat/>
-    <w:rsid w:val="00095EEA"/>
+    <w:rsid w:val="00FF6748"/>
     <w:pPr>
       <w:keepNext/>
       <w:keepLines/>
@@ -1175,7 +1157,7 @@
     <w:semiHidden/>
     <w:unhideWhenUsed/>
     <w:qFormat/>
-    <w:rsid w:val="00095EEA"/>
+    <w:rsid w:val="00FF6748"/>
     <w:pPr>
       <w:keepNext/>
       <w:keepLines/>
@@ -1198,7 +1180,7 @@
     <w:semiHidden/>
     <w:unhideWhenUsed/>
     <w:qFormat/>
-    <w:rsid w:val="00095EEA"/>
+    <w:rsid w:val="00FF6748"/>
     <w:pPr>
       <w:keepNext/>
       <w:keepLines/>
@@ -1242,7 +1224,7 @@
     <w:basedOn w:val="Fontepargpadro"/>
     <w:link w:val="Ttulo1"/>
     <w:uiPriority w:val="9"/>
-    <w:rsid w:val="00095EEA"/>
+    <w:rsid w:val="00FF6748"/>
     <w:rPr>
       <w:rFonts w:asciiTheme="majorHAnsi" w:eastAsiaTheme="majorEastAsia" w:hAnsiTheme="majorHAnsi" w:cstheme="majorBidi"/>
       <w:color w:val="0F4761" w:themeColor="accent1" w:themeShade="BF"/>
@@ -1256,7 +1238,7 @@
     <w:link w:val="Ttulo2"/>
     <w:uiPriority w:val="9"/>
     <w:semiHidden/>
-    <w:rsid w:val="00095EEA"/>
+    <w:rsid w:val="00FF6748"/>
     <w:rPr>
       <w:rFonts w:asciiTheme="majorHAnsi" w:eastAsiaTheme="majorEastAsia" w:hAnsiTheme="majorHAnsi" w:cstheme="majorBidi"/>
       <w:color w:val="0F4761" w:themeColor="accent1" w:themeShade="BF"/>
@@ -1270,7 +1252,7 @@
     <w:link w:val="Ttulo3"/>
     <w:uiPriority w:val="9"/>
     <w:semiHidden/>
-    <w:rsid w:val="00095EEA"/>
+    <w:rsid w:val="00FF6748"/>
     <w:rPr>
       <w:rFonts w:eastAsiaTheme="majorEastAsia" w:cstheme="majorBidi"/>
       <w:color w:val="0F4761" w:themeColor="accent1" w:themeShade="BF"/>
@@ -1284,7 +1266,7 @@
     <w:link w:val="Ttulo4"/>
     <w:uiPriority w:val="9"/>
     <w:semiHidden/>
-    <w:rsid w:val="00095EEA"/>
+    <w:rsid w:val="00FF6748"/>
     <w:rPr>
       <w:rFonts w:eastAsiaTheme="majorEastAsia" w:cstheme="majorBidi"/>
       <w:i/>
@@ -1298,7 +1280,7 @@
     <w:link w:val="Ttulo5"/>
     <w:uiPriority w:val="9"/>
     <w:semiHidden/>
-    <w:rsid w:val="00095EEA"/>
+    <w:rsid w:val="00FF6748"/>
     <w:rPr>
       <w:rFonts w:eastAsiaTheme="majorEastAsia" w:cstheme="majorBidi"/>
       <w:color w:val="0F4761" w:themeColor="accent1" w:themeShade="BF"/>
@@ -1310,7 +1292,7 @@
     <w:link w:val="Ttulo6"/>
     <w:uiPriority w:val="9"/>
     <w:semiHidden/>
-    <w:rsid w:val="00095EEA"/>
+    <w:rsid w:val="00FF6748"/>
     <w:rPr>
       <w:rFonts w:eastAsiaTheme="majorEastAsia" w:cstheme="majorBidi"/>
       <w:i/>
@@ -1324,7 +1306,7 @@
     <w:link w:val="Ttulo7"/>
     <w:uiPriority w:val="9"/>
     <w:semiHidden/>
-    <w:rsid w:val="00095EEA"/>
+    <w:rsid w:val="00FF6748"/>
     <w:rPr>
       <w:rFonts w:eastAsiaTheme="majorEastAsia" w:cstheme="majorBidi"/>
       <w:color w:val="595959" w:themeColor="text1" w:themeTint="A6"/>
@@ -1336,7 +1318,7 @@
     <w:link w:val="Ttulo8"/>
     <w:uiPriority w:val="9"/>
     <w:semiHidden/>
-    <w:rsid w:val="00095EEA"/>
+    <w:rsid w:val="00FF6748"/>
     <w:rPr>
       <w:rFonts w:eastAsiaTheme="majorEastAsia" w:cstheme="majorBidi"/>
       <w:i/>
@@ -1350,7 +1332,7 @@
     <w:link w:val="Ttulo9"/>
     <w:uiPriority w:val="9"/>
     <w:semiHidden/>
-    <w:rsid w:val="00095EEA"/>
+    <w:rsid w:val="00FF6748"/>
     <w:rPr>
       <w:rFonts w:eastAsiaTheme="majorEastAsia" w:cstheme="majorBidi"/>
       <w:color w:val="272727" w:themeColor="text1" w:themeTint="D8"/>
@@ -1363,7 +1345,7 @@
     <w:link w:val="TtuloChar"/>
     <w:uiPriority w:val="10"/>
     <w:qFormat/>
-    <w:rsid w:val="00095EEA"/>
+    <w:rsid w:val="00FF6748"/>
     <w:pPr>
       <w:spacing w:after="80" w:line="240" w:lineRule="auto"/>
       <w:contextualSpacing/>
@@ -1381,7 +1363,7 @@
     <w:basedOn w:val="Fontepargpadro"/>
     <w:link w:val="Ttulo"/>
     <w:uiPriority w:val="10"/>
-    <w:rsid w:val="00095EEA"/>
+    <w:rsid w:val="00FF6748"/>
     <w:rPr>
       <w:rFonts w:asciiTheme="majorHAnsi" w:eastAsiaTheme="majorEastAsia" w:hAnsiTheme="majorHAnsi" w:cstheme="majorBidi"/>
       <w:spacing w:val="-10"/>
@@ -1397,7 +1379,7 @@
     <w:link w:val="SubttuloChar"/>
     <w:uiPriority w:val="11"/>
     <w:qFormat/>
-    <w:rsid w:val="00095EEA"/>
+    <w:rsid w:val="00FF6748"/>
     <w:pPr>
       <w:numPr>
         <w:ilvl w:val="1"/>
@@ -1416,7 +1398,7 @@
     <w:basedOn w:val="Fontepargpadro"/>
     <w:link w:val="Subttulo"/>
     <w:uiPriority w:val="11"/>
-    <w:rsid w:val="00095EEA"/>
+    <w:rsid w:val="00FF6748"/>
     <w:rPr>
       <w:rFonts w:eastAsiaTheme="majorEastAsia" w:cstheme="majorBidi"/>
       <w:color w:val="595959" w:themeColor="text1" w:themeTint="A6"/>
@@ -1432,7 +1414,7 @@
     <w:link w:val="CitaoChar"/>
     <w:uiPriority w:val="29"/>
     <w:qFormat/>
-    <w:rsid w:val="00095EEA"/>
+    <w:rsid w:val="00FF6748"/>
     <w:pPr>
       <w:spacing w:before="160"/>
       <w:jc w:val="center"/>
@@ -1448,7 +1430,7 @@
     <w:basedOn w:val="Fontepargpadro"/>
     <w:link w:val="Citao"/>
     <w:uiPriority w:val="29"/>
-    <w:rsid w:val="00095EEA"/>
+    <w:rsid w:val="00FF6748"/>
     <w:rPr>
       <w:i/>
       <w:iCs/>
@@ -1460,7 +1442,7 @@
     <w:basedOn w:val="Normal"/>
     <w:uiPriority w:val="34"/>
     <w:qFormat/>
-    <w:rsid w:val="00095EEA"/>
+    <w:rsid w:val="00FF6748"/>
     <w:pPr>
       <w:ind w:left="720"/>
       <w:contextualSpacing/>
@@ -1471,7 +1453,7 @@
     <w:basedOn w:val="Fontepargpadro"/>
     <w:uiPriority w:val="21"/>
     <w:qFormat/>
-    <w:rsid w:val="00095EEA"/>
+    <w:rsid w:val="00FF6748"/>
     <w:rPr>
       <w:i/>
       <w:iCs/>
@@ -1485,7 +1467,7 @@
     <w:link w:val="CitaoIntensaChar"/>
     <w:uiPriority w:val="30"/>
     <w:qFormat/>
-    <w:rsid w:val="00095EEA"/>
+    <w:rsid w:val="00FF6748"/>
     <w:pPr>
       <w:pBdr>
         <w:top w:val="single" w:sz="4" w:space="10" w:color="0F4761" w:themeColor="accent1" w:themeShade="BF"/>
@@ -1506,7 +1488,7 @@
     <w:basedOn w:val="Fontepargpadro"/>
     <w:link w:val="CitaoIntensa"/>
     <w:uiPriority w:val="30"/>
-    <w:rsid w:val="00095EEA"/>
+    <w:rsid w:val="00FF6748"/>
     <w:rPr>
       <w:i/>
       <w:iCs/>
@@ -1518,7 +1500,7 @@
     <w:basedOn w:val="Fontepargpadro"/>
     <w:uiPriority w:val="32"/>
     <w:qFormat/>
-    <w:rsid w:val="00095EEA"/>
+    <w:rsid w:val="00FF6748"/>
     <w:rPr>
       <w:b/>
       <w:bCs/>

</xml_diff>